<commit_message>
run time report done
</commit_message>
<xml_diff>
--- a/task/Work Definition-721- code.docx
+++ b/task/Work Definition-721- code.docx
@@ -522,18 +522,6 @@
           <w:shd w:fill="auto" w:val="clear"/>
         </w:rPr>
       </w:pPr>
-      <w:r>
-        <w:rPr>
-          <w:rFonts w:ascii="Times New Roman" w:hAnsi="Times New Roman" w:cs="Times New Roman" w:eastAsia="Times New Roman"/>
-          <w:b/>
-          <w:color w:val="auto"/>
-          <w:spacing w:val="0"/>
-          <w:position w:val="0"/>
-          <w:sz w:val="28"/>
-          <w:shd w:fill="auto" w:val="clear"/>
-        </w:rPr>
-        <w:t xml:space="preserve">Wilcoxon</w:t>
-      </w:r>
     </w:p>
     <w:p>
       <w:pPr>

</xml_diff>